<commit_message>
Ajout des descriptions de personnages Tam Magyar-Amyth et Simon Cussonnet.
</commit_message>
<xml_diff>
--- a/doc/Personnages.docx
+++ b/doc/Personnages.docx
@@ -1,6 +1,6 @@
 
 <file path=word/document.xml><?xml version="1.0" encoding="utf-8"?>
-<w:document xmlns:wpc="http://schemas.microsoft.com/office/word/2010/wordprocessingCanvas" xmlns:cx="http://schemas.microsoft.com/office/drawing/2014/chartex" xmlns:cx1="http://schemas.microsoft.com/office/drawing/2015/9/8/chartex" xmlns:cx2="http://schemas.microsoft.com/office/drawing/2015/10/21/chartex" xmlns:cx3="http://schemas.microsoft.com/office/drawing/2016/5/9/chartex" xmlns:cx4="http://schemas.microsoft.com/office/drawing/2016/5/10/chartex" xmlns:cx5="http://schemas.microsoft.com/office/drawing/2016/5/11/chartex" xmlns:cx6="http://schemas.microsoft.com/office/drawing/2016/5/12/chartex" xmlns:cx7="http://schemas.microsoft.com/office/drawing/2016/5/13/chartex" xmlns:cx8="http://schemas.microsoft.com/office/drawing/2016/5/14/chartex" xmlns:mc="http://schemas.openxmlformats.org/markup-compatibility/2006" xmlns:aink="http://schemas.microsoft.com/office/drawing/2016/ink" xmlns:am3d="http://schemas.microsoft.com/office/drawing/2017/model3d" xmlns:o="urn:schemas-microsoft-com:office:office" xmlns:oel="http://schemas.microsoft.com/office/2019/extlst" xmlns:r="http://schemas.openxmlformats.org/officeDocument/2006/relationships" xmlns:m="http://schemas.openxmlformats.org/officeDocument/2006/math" xmlns:v="urn:schemas-microsoft-com:vml" xmlns:wp14="http://schemas.microsoft.com/office/word/2010/wordprocessingDrawing" xmlns:wp="http://schemas.openxmlformats.org/drawingml/2006/wordprocessingDrawing" xmlns:w10="urn:schemas-microsoft-com:office:word" xmlns:w="http://schemas.openxmlformats.org/wordprocessingml/2006/main" xmlns:w14="http://schemas.microsoft.com/office/word/2010/wordml" xmlns:w15="http://schemas.microsoft.com/office/word/2012/wordml" xmlns:w16cex="http://schemas.microsoft.com/office/word/2018/wordml/cex" xmlns:w16cid="http://schemas.microsoft.com/office/word/2016/wordml/cid" xmlns:w16="http://schemas.microsoft.com/office/word/2018/wordml" xmlns:w16sdtdh="http://schemas.microsoft.com/office/word/2020/wordml/sdtdatahash" xmlns:w16se="http://schemas.microsoft.com/office/word/2015/wordml/symex" xmlns:wpg="http://schemas.microsoft.com/office/word/2010/wordprocessingGroup" xmlns:wpi="http://schemas.microsoft.com/office/word/2010/wordprocessingInk" xmlns:wne="http://schemas.microsoft.com/office/word/2006/wordml" xmlns:wps="http://schemas.microsoft.com/office/word/2010/wordprocessingShape" mc:Ignorable="w14 w15 w16se w16cid w16 w16cex w16sdtdh wp14">
+<w:document xmlns:wpc="http://schemas.microsoft.com/office/word/2010/wordprocessingCanvas" xmlns:cx="http://schemas.microsoft.com/office/drawing/2014/chartex" xmlns:cx1="http://schemas.microsoft.com/office/drawing/2015/9/8/chartex" xmlns:cx2="http://schemas.microsoft.com/office/drawing/2015/10/21/chartex" xmlns:cx3="http://schemas.microsoft.com/office/drawing/2016/5/9/chartex" xmlns:cx4="http://schemas.microsoft.com/office/drawing/2016/5/10/chartex" xmlns:cx5="http://schemas.microsoft.com/office/drawing/2016/5/11/chartex" xmlns:cx6="http://schemas.microsoft.com/office/drawing/2016/5/12/chartex" xmlns:cx7="http://schemas.microsoft.com/office/drawing/2016/5/13/chartex" xmlns:cx8="http://schemas.microsoft.com/office/drawing/2016/5/14/chartex" xmlns:mc="http://schemas.openxmlformats.org/markup-compatibility/2006" xmlns:aink="http://schemas.microsoft.com/office/drawing/2016/ink" xmlns:am3d="http://schemas.microsoft.com/office/drawing/2017/model3d" xmlns:o="urn:schemas-microsoft-com:office:office" xmlns:oel="http://schemas.microsoft.com/office/2019/extlst" xmlns:r="http://schemas.openxmlformats.org/officeDocument/2006/relationships" xmlns:m="http://schemas.openxmlformats.org/officeDocument/2006/math" xmlns:v="urn:schemas-microsoft-com:vml" xmlns:wp14="http://schemas.microsoft.com/office/word/2010/wordprocessingDrawing" xmlns:wp="http://schemas.openxmlformats.org/drawingml/2006/wordprocessingDrawing" xmlns:w10="urn:schemas-microsoft-com:office:word" xmlns:w="http://schemas.openxmlformats.org/wordprocessingml/2006/main" xmlns:w14="http://schemas.microsoft.com/office/word/2010/wordml" xmlns:w15="http://schemas.microsoft.com/office/word/2012/wordml" xmlns:w16cex="http://schemas.microsoft.com/office/word/2018/wordml/cex" xmlns:w16cid="http://schemas.microsoft.com/office/word/2016/wordml/cid" xmlns:w16="http://schemas.microsoft.com/office/word/2018/wordml" xmlns:w16du="http://schemas.microsoft.com/office/word/2023/wordml/word16du" xmlns:w16sdtdh="http://schemas.microsoft.com/office/word/2020/wordml/sdtdatahash" xmlns:w16sdtfl="http://schemas.microsoft.com/office/word/2024/wordml/sdtformatlock" xmlns:w16se="http://schemas.microsoft.com/office/word/2015/wordml/symex" xmlns:wpg="http://schemas.microsoft.com/office/word/2010/wordprocessingGroup" xmlns:wpi="http://schemas.microsoft.com/office/word/2010/wordprocessingInk" xmlns:wne="http://schemas.microsoft.com/office/word/2006/wordml" xmlns:wps="http://schemas.microsoft.com/office/word/2010/wordprocessingShape" mc:Ignorable="w14 w15 w16se w16cid w16 w16cex w16sdtdh w16sdtfl w16du wp14">
   <w:body>
     <w:tbl>
       <w:tblPr>
@@ -94,6 +94,7 @@
                 <w:rFonts w:ascii="Baskerville Old Face" w:hAnsi="Baskerville Old Face"/>
                 <w:b/>
                 <w:bCs/>
+                <w:noProof/>
                 <w:sz w:val="28"/>
                 <w:szCs w:val="28"/>
               </w:rPr>
@@ -113,7 +114,7 @@
                           <pic:cNvPicPr/>
                         </pic:nvPicPr>
                         <pic:blipFill>
-                          <a:blip r:embed="rId4"/>
+                          <a:blip r:embed="rId5"/>
                           <a:stretch>
                             <a:fillRect/>
                           </a:stretch>
@@ -450,18 +451,16 @@
                 <w:sz w:val="28"/>
                 <w:szCs w:val="28"/>
               </w:rPr>
-              <w:t xml:space="preserve">le personnage principal de l’aventure. Elle doit constamment lutter pour arriver à ses fins, et elle n’est entourée que de bras cassés et d’incapables. A commencer par son garde </w:t>
-            </w:r>
-            <w:proofErr w:type="gramStart"/>
-            <w:r>
-              <w:rPr>
-                <w:rFonts w:ascii="Baskerville Old Face" w:hAnsi="Baskerville Old Face"/>
-                <w:sz w:val="28"/>
-                <w:szCs w:val="28"/>
-              </w:rPr>
-              <w:t>du corp</w:t>
-            </w:r>
-            <w:proofErr w:type="gramEnd"/>
+              <w:t>le personnage principal de l’aventure. Elle doit constamment lutter pour arriver à ses fins, et elle n’est entourée que de bras cassés et d’incapables. A commencer par son garde du corp</w:t>
+            </w:r>
+            <w:r>
+              <w:rPr>
+                <w:rFonts w:ascii="Baskerville Old Face" w:hAnsi="Baskerville Old Face"/>
+                <w:sz w:val="28"/>
+                <w:szCs w:val="28"/>
+              </w:rPr>
+              <w:t>s</w:t>
+            </w:r>
             <w:r>
               <w:rPr>
                 <w:rFonts w:ascii="Baskerville Old Face" w:hAnsi="Baskerville Old Face"/>
@@ -526,6 +525,1427 @@
           <w:szCs w:val="28"/>
         </w:rPr>
       </w:pPr>
+      <w:r>
+        <w:rPr>
+          <w:rFonts w:ascii="Baskerville Old Face" w:hAnsi="Baskerville Old Face"/>
+          <w:sz w:val="28"/>
+          <w:szCs w:val="28"/>
+        </w:rPr>
+        <w:br w:type="page"/>
+      </w:r>
+    </w:p>
+    <w:tbl>
+      <w:tblPr>
+        <w:tblStyle w:val="Grilledutableau"/>
+        <w:tblW w:w="0" w:type="auto"/>
+        <w:tblBorders>
+          <w:top w:val="none" w:sz="0" w:space="0" w:color="auto"/>
+          <w:left w:val="none" w:sz="0" w:space="0" w:color="auto"/>
+          <w:bottom w:val="none" w:sz="0" w:space="0" w:color="auto"/>
+          <w:right w:val="none" w:sz="0" w:space="0" w:color="auto"/>
+          <w:insideH w:val="none" w:sz="0" w:space="0" w:color="auto"/>
+          <w:insideV w:val="none" w:sz="0" w:space="0" w:color="auto"/>
+        </w:tblBorders>
+        <w:tblLook w:val="04A0" w:firstRow="1" w:lastRow="0" w:firstColumn="1" w:lastColumn="0" w:noHBand="0" w:noVBand="1"/>
+      </w:tblPr>
+      <w:tblGrid>
+        <w:gridCol w:w="1589"/>
+        <w:gridCol w:w="4118"/>
+        <w:gridCol w:w="3365"/>
+      </w:tblGrid>
+      <w:tr>
+        <w:tc>
+          <w:tcPr>
+            <w:tcW w:w="1577" w:type="dxa"/>
+          </w:tcPr>
+          <w:p>
+            <w:pPr>
+              <w:rPr>
+                <w:rFonts w:ascii="Baskerville Old Face" w:hAnsi="Baskerville Old Face"/>
+                <w:b/>
+                <w:bCs/>
+                <w:sz w:val="28"/>
+                <w:szCs w:val="28"/>
+              </w:rPr>
+            </w:pPr>
+            <w:r>
+              <w:rPr>
+                <w:rFonts w:ascii="Baskerville Old Face" w:hAnsi="Baskerville Old Face"/>
+                <w:b/>
+                <w:bCs/>
+                <w:sz w:val="28"/>
+                <w:szCs w:val="28"/>
+              </w:rPr>
+              <w:lastRenderedPageBreak/>
+              <w:t>Nom</w:t>
+            </w:r>
+          </w:p>
+        </w:tc>
+        <w:tc>
+          <w:tcPr>
+            <w:tcW w:w="4119" w:type="dxa"/>
+          </w:tcPr>
+          <w:p>
+            <w:pPr>
+              <w:rPr>
+                <w:rFonts w:ascii="Baskerville Old Face" w:hAnsi="Baskerville Old Face"/>
+                <w:b/>
+                <w:bCs/>
+                <w:sz w:val="28"/>
+                <w:szCs w:val="28"/>
+              </w:rPr>
+            </w:pPr>
+            <w:r>
+              <w:rPr>
+                <w:rFonts w:ascii="Baskerville Old Face" w:hAnsi="Baskerville Old Face"/>
+                <w:sz w:val="28"/>
+                <w:szCs w:val="28"/>
+              </w:rPr>
+              <w:t>Tam Magyar-</w:t>
+            </w:r>
+            <w:proofErr w:type="spellStart"/>
+            <w:r>
+              <w:rPr>
+                <w:rFonts w:ascii="Baskerville Old Face" w:hAnsi="Baskerville Old Face"/>
+                <w:sz w:val="28"/>
+                <w:szCs w:val="28"/>
+              </w:rPr>
+              <w:t>Amyth</w:t>
+            </w:r>
+            <w:proofErr w:type="spellEnd"/>
+          </w:p>
+        </w:tc>
+        <w:tc>
+          <w:tcPr>
+            <w:tcW w:w="3366" w:type="dxa"/>
+            <w:vMerge w:val="restart"/>
+          </w:tcPr>
+          <w:p>
+            <w:pPr>
+              <w:rPr>
+                <w:rFonts w:ascii="Baskerville Old Face" w:hAnsi="Baskerville Old Face"/>
+                <w:b/>
+                <w:bCs/>
+                <w:sz w:val="28"/>
+                <w:szCs w:val="28"/>
+              </w:rPr>
+            </w:pPr>
+          </w:p>
+        </w:tc>
+      </w:tr>
+      <w:tr>
+        <w:tc>
+          <w:tcPr>
+            <w:tcW w:w="1577" w:type="dxa"/>
+          </w:tcPr>
+          <w:p>
+            <w:pPr>
+              <w:rPr>
+                <w:rFonts w:ascii="Baskerville Old Face" w:hAnsi="Baskerville Old Face"/>
+                <w:b/>
+                <w:bCs/>
+                <w:sz w:val="28"/>
+                <w:szCs w:val="28"/>
+              </w:rPr>
+            </w:pPr>
+            <w:r>
+              <w:rPr>
+                <w:rFonts w:ascii="Baskerville Old Face" w:hAnsi="Baskerville Old Face"/>
+                <w:b/>
+                <w:bCs/>
+                <w:sz w:val="28"/>
+                <w:szCs w:val="28"/>
+              </w:rPr>
+              <w:t>Origine</w:t>
+            </w:r>
+            <w:r>
+              <w:rPr>
+                <w:rFonts w:ascii="Baskerville Old Face" w:hAnsi="Baskerville Old Face"/>
+                <w:sz w:val="28"/>
+                <w:szCs w:val="28"/>
+              </w:rPr>
+              <w:t> </w:t>
+            </w:r>
+          </w:p>
+        </w:tc>
+        <w:tc>
+          <w:tcPr>
+            <w:tcW w:w="4119" w:type="dxa"/>
+          </w:tcPr>
+          <w:p>
+            <w:pPr>
+              <w:rPr>
+                <w:rFonts w:ascii="Baskerville Old Face" w:hAnsi="Baskerville Old Face"/>
+                <w:b/>
+                <w:bCs/>
+                <w:sz w:val="28"/>
+                <w:szCs w:val="28"/>
+              </w:rPr>
+            </w:pPr>
+            <w:r>
+              <w:rPr>
+                <w:rFonts w:ascii="Baskerville Old Face" w:hAnsi="Baskerville Old Face"/>
+                <w:sz w:val="28"/>
+                <w:szCs w:val="28"/>
+              </w:rPr>
+              <w:t>???</w:t>
+            </w:r>
+          </w:p>
+        </w:tc>
+        <w:tc>
+          <w:tcPr>
+            <w:tcW w:w="3366" w:type="dxa"/>
+            <w:vMerge/>
+          </w:tcPr>
+          <w:p>
+            <w:pPr>
+              <w:rPr>
+                <w:rFonts w:ascii="Baskerville Old Face" w:hAnsi="Baskerville Old Face"/>
+                <w:b/>
+                <w:bCs/>
+                <w:sz w:val="28"/>
+                <w:szCs w:val="28"/>
+              </w:rPr>
+            </w:pPr>
+          </w:p>
+        </w:tc>
+      </w:tr>
+      <w:tr>
+        <w:tc>
+          <w:tcPr>
+            <w:tcW w:w="1577" w:type="dxa"/>
+          </w:tcPr>
+          <w:p>
+            <w:pPr>
+              <w:rPr>
+                <w:rFonts w:ascii="Baskerville Old Face" w:hAnsi="Baskerville Old Face"/>
+                <w:b/>
+                <w:bCs/>
+                <w:sz w:val="28"/>
+                <w:szCs w:val="28"/>
+              </w:rPr>
+            </w:pPr>
+            <w:r>
+              <w:rPr>
+                <w:rFonts w:ascii="Baskerville Old Face" w:hAnsi="Baskerville Old Face"/>
+                <w:b/>
+                <w:bCs/>
+                <w:sz w:val="28"/>
+                <w:szCs w:val="28"/>
+              </w:rPr>
+              <w:t>Vocation</w:t>
+            </w:r>
+            <w:r>
+              <w:rPr>
+                <w:rFonts w:ascii="Baskerville Old Face" w:hAnsi="Baskerville Old Face"/>
+                <w:sz w:val="28"/>
+                <w:szCs w:val="28"/>
+              </w:rPr>
+              <w:t> </w:t>
+            </w:r>
+          </w:p>
+        </w:tc>
+        <w:tc>
+          <w:tcPr>
+            <w:tcW w:w="4119" w:type="dxa"/>
+          </w:tcPr>
+          <w:p>
+            <w:pPr>
+              <w:rPr>
+                <w:rFonts w:ascii="Baskerville Old Face" w:hAnsi="Baskerville Old Face"/>
+                <w:b/>
+                <w:bCs/>
+                <w:sz w:val="28"/>
+                <w:szCs w:val="28"/>
+              </w:rPr>
+            </w:pPr>
+            <w:r>
+              <w:rPr>
+                <w:rFonts w:ascii="Baskerville Old Face" w:hAnsi="Baskerville Old Face"/>
+                <w:sz w:val="28"/>
+                <w:szCs w:val="28"/>
+              </w:rPr>
+              <w:t xml:space="preserve">Sage Immortelle / </w:t>
+            </w:r>
+            <w:r>
+              <w:rPr>
+                <w:rFonts w:ascii="Baskerville Old Face" w:hAnsi="Baskerville Old Face"/>
+                <w:sz w:val="28"/>
+                <w:szCs w:val="28"/>
+              </w:rPr>
+              <w:t>Démon</w:t>
+            </w:r>
+          </w:p>
+        </w:tc>
+        <w:tc>
+          <w:tcPr>
+            <w:tcW w:w="3366" w:type="dxa"/>
+            <w:vMerge/>
+          </w:tcPr>
+          <w:p>
+            <w:pPr>
+              <w:rPr>
+                <w:rFonts w:ascii="Baskerville Old Face" w:hAnsi="Baskerville Old Face"/>
+                <w:b/>
+                <w:bCs/>
+                <w:sz w:val="28"/>
+                <w:szCs w:val="28"/>
+              </w:rPr>
+            </w:pPr>
+          </w:p>
+        </w:tc>
+      </w:tr>
+      <w:tr>
+        <w:tc>
+          <w:tcPr>
+            <w:tcW w:w="1577" w:type="dxa"/>
+          </w:tcPr>
+          <w:p>
+            <w:pPr>
+              <w:rPr>
+                <w:rFonts w:ascii="Baskerville Old Face" w:hAnsi="Baskerville Old Face"/>
+                <w:b/>
+                <w:bCs/>
+                <w:sz w:val="28"/>
+                <w:szCs w:val="28"/>
+              </w:rPr>
+            </w:pPr>
+            <w:r>
+              <w:rPr>
+                <w:rFonts w:ascii="Baskerville Old Face" w:hAnsi="Baskerville Old Face"/>
+                <w:b/>
+                <w:bCs/>
+                <w:sz w:val="28"/>
+                <w:szCs w:val="28"/>
+              </w:rPr>
+              <w:t>PNJ</w:t>
+            </w:r>
+            <w:r>
+              <w:rPr>
+                <w:rFonts w:ascii="Baskerville Old Face" w:hAnsi="Baskerville Old Face"/>
+                <w:sz w:val="28"/>
+                <w:szCs w:val="28"/>
+              </w:rPr>
+              <w:t> </w:t>
+            </w:r>
+          </w:p>
+        </w:tc>
+        <w:tc>
+          <w:tcPr>
+            <w:tcW w:w="4119" w:type="dxa"/>
+          </w:tcPr>
+          <w:p>
+            <w:pPr>
+              <w:rPr>
+                <w:rFonts w:ascii="Baskerville Old Face" w:hAnsi="Baskerville Old Face"/>
+                <w:b/>
+                <w:bCs/>
+                <w:sz w:val="28"/>
+                <w:szCs w:val="28"/>
+              </w:rPr>
+            </w:pPr>
+            <w:r>
+              <w:rPr>
+                <w:rFonts w:ascii="Baskerville Old Face" w:hAnsi="Baskerville Old Face"/>
+                <w:sz w:val="28"/>
+                <w:szCs w:val="28"/>
+              </w:rPr>
+              <w:t>Non</w:t>
+            </w:r>
+          </w:p>
+        </w:tc>
+        <w:tc>
+          <w:tcPr>
+            <w:tcW w:w="3366" w:type="dxa"/>
+            <w:vMerge/>
+          </w:tcPr>
+          <w:p>
+            <w:pPr>
+              <w:rPr>
+                <w:rFonts w:ascii="Baskerville Old Face" w:hAnsi="Baskerville Old Face"/>
+                <w:b/>
+                <w:bCs/>
+                <w:sz w:val="28"/>
+                <w:szCs w:val="28"/>
+              </w:rPr>
+            </w:pPr>
+          </w:p>
+        </w:tc>
+      </w:tr>
+      <w:tr>
+        <w:tc>
+          <w:tcPr>
+            <w:tcW w:w="1577" w:type="dxa"/>
+          </w:tcPr>
+          <w:p>
+            <w:pPr>
+              <w:rPr>
+                <w:rFonts w:ascii="Baskerville Old Face" w:hAnsi="Baskerville Old Face"/>
+                <w:b/>
+                <w:bCs/>
+                <w:sz w:val="28"/>
+                <w:szCs w:val="28"/>
+              </w:rPr>
+            </w:pPr>
+            <w:r>
+              <w:rPr>
+                <w:rFonts w:ascii="Baskerville Old Face" w:hAnsi="Baskerville Old Face"/>
+                <w:b/>
+                <w:bCs/>
+                <w:sz w:val="28"/>
+                <w:szCs w:val="28"/>
+              </w:rPr>
+              <w:t>Description</w:t>
+            </w:r>
+            <w:r>
+              <w:rPr>
+                <w:rFonts w:ascii="Baskerville Old Face" w:hAnsi="Baskerville Old Face"/>
+                <w:sz w:val="28"/>
+                <w:szCs w:val="28"/>
+              </w:rPr>
+              <w:t> </w:t>
+            </w:r>
+          </w:p>
+        </w:tc>
+        <w:tc>
+          <w:tcPr>
+            <w:tcW w:w="4119" w:type="dxa"/>
+          </w:tcPr>
+          <w:p>
+            <w:pPr>
+              <w:rPr>
+                <w:rFonts w:ascii="Baskerville Old Face" w:hAnsi="Baskerville Old Face"/>
+                <w:sz w:val="28"/>
+                <w:szCs w:val="28"/>
+              </w:rPr>
+            </w:pPr>
+            <w:r>
+              <w:rPr>
+                <w:rFonts w:ascii="Baskerville Old Face" w:hAnsi="Baskerville Old Face"/>
+                <w:sz w:val="28"/>
+                <w:szCs w:val="28"/>
+              </w:rPr>
+              <w:t>Contrairement à tout ce qui a été dit précédemment, le personnage principal, c’est Tam.</w:t>
+            </w:r>
+          </w:p>
+          <w:p>
+            <w:pPr>
+              <w:rPr>
+                <w:rFonts w:ascii="Baskerville Old Face" w:hAnsi="Baskerville Old Face"/>
+                <w:sz w:val="28"/>
+                <w:szCs w:val="28"/>
+              </w:rPr>
+            </w:pPr>
+            <w:r>
+              <w:rPr>
+                <w:rFonts w:ascii="Baskerville Old Face" w:hAnsi="Baskerville Old Face"/>
+                <w:sz w:val="28"/>
+                <w:szCs w:val="28"/>
+              </w:rPr>
+              <w:t>Tout ce qui arrive</w:t>
+            </w:r>
+            <w:r>
+              <w:rPr>
+                <w:rFonts w:ascii="Baskerville Old Face" w:hAnsi="Baskerville Old Face"/>
+                <w:sz w:val="28"/>
+                <w:szCs w:val="28"/>
+              </w:rPr>
+              <w:t xml:space="preserve"> est lié à ce personnage.</w:t>
+            </w:r>
+          </w:p>
+          <w:p>
+            <w:pPr>
+              <w:rPr>
+                <w:rFonts w:ascii="Baskerville Old Face" w:hAnsi="Baskerville Old Face"/>
+                <w:sz w:val="28"/>
+                <w:szCs w:val="28"/>
+              </w:rPr>
+            </w:pPr>
+            <w:r>
+              <w:rPr>
+                <w:rFonts w:ascii="Baskerville Old Face" w:hAnsi="Baskerville Old Face"/>
+                <w:sz w:val="28"/>
+                <w:szCs w:val="28"/>
+              </w:rPr>
+              <w:t xml:space="preserve">Tam est née </w:t>
+            </w:r>
+            <w:r>
+              <w:rPr>
+                <w:rFonts w:ascii="Baskerville Old Face" w:hAnsi="Baskerville Old Face"/>
+                <w:sz w:val="28"/>
+                <w:szCs w:val="28"/>
+              </w:rPr>
+              <w:t xml:space="preserve">au paléolithique. Elle fait partie d’une tribu d’explorateurs dont les ancêtres se sont rendus sur les terres de ce qui sera plus tard le royaume de </w:t>
+            </w:r>
+            <w:proofErr w:type="spellStart"/>
+            <w:r>
+              <w:rPr>
+                <w:rFonts w:ascii="Baskerville Old Face" w:hAnsi="Baskerville Old Face"/>
+                <w:sz w:val="28"/>
+                <w:szCs w:val="28"/>
+              </w:rPr>
+              <w:t>LuyNhuyre</w:t>
+            </w:r>
+            <w:proofErr w:type="spellEnd"/>
+            <w:r>
+              <w:rPr>
+                <w:rFonts w:ascii="Baskerville Old Face" w:hAnsi="Baskerville Old Face"/>
+                <w:sz w:val="28"/>
+                <w:szCs w:val="28"/>
+              </w:rPr>
+              <w:t>.</w:t>
+            </w:r>
+          </w:p>
+          <w:p>
+            <w:pPr>
+              <w:rPr>
+                <w:rFonts w:ascii="Baskerville Old Face" w:hAnsi="Baskerville Old Face"/>
+                <w:sz w:val="28"/>
+                <w:szCs w:val="28"/>
+              </w:rPr>
+            </w:pPr>
+            <w:r>
+              <w:rPr>
+                <w:rFonts w:ascii="Baskerville Old Face" w:hAnsi="Baskerville Old Face"/>
+                <w:sz w:val="28"/>
+                <w:szCs w:val="28"/>
+              </w:rPr>
+              <w:t>Là, ils y ont découvert une pierre</w:t>
+            </w:r>
+            <w:r>
+              <w:rPr>
+                <w:rFonts w:ascii="Baskerville Old Face" w:hAnsi="Baskerville Old Face"/>
+                <w:sz w:val="28"/>
+                <w:szCs w:val="28"/>
+              </w:rPr>
+              <w:t xml:space="preserve"> (tombée du ciel)</w:t>
+            </w:r>
+            <w:r>
+              <w:rPr>
+                <w:rFonts w:ascii="Baskerville Old Face" w:hAnsi="Baskerville Old Face"/>
+                <w:sz w:val="28"/>
+                <w:szCs w:val="28"/>
+              </w:rPr>
+              <w:t xml:space="preserve"> qui leur a apporté une sagesse infinie et l’immortalité en les faisant évoluer en accéléré vers la forme animale la plus parfaite</w:t>
+            </w:r>
+            <w:r>
+              <w:rPr>
+                <w:rFonts w:ascii="Baskerville Old Face" w:hAnsi="Baskerville Old Face"/>
+                <w:sz w:val="28"/>
+                <w:szCs w:val="28"/>
+              </w:rPr>
+              <w:t xml:space="preserve"> (expliquant leur apparence démoniaque)</w:t>
+            </w:r>
+            <w:r>
+              <w:rPr>
+                <w:rFonts w:ascii="Baskerville Old Face" w:hAnsi="Baskerville Old Face"/>
+                <w:sz w:val="28"/>
+                <w:szCs w:val="28"/>
+              </w:rPr>
+              <w:t xml:space="preserve"> </w:t>
+            </w:r>
+            <w:r>
+              <w:rPr>
+                <w:rFonts w:ascii="Baskerville Old Face" w:hAnsi="Baskerville Old Face"/>
+                <w:sz w:val="28"/>
+                <w:szCs w:val="28"/>
+              </w:rPr>
+              <w:t>et en leur permettant</w:t>
+            </w:r>
+            <w:r>
+              <w:rPr>
+                <w:rFonts w:ascii="Baskerville Old Face" w:hAnsi="Baskerville Old Face"/>
+                <w:sz w:val="28"/>
+                <w:szCs w:val="28"/>
+              </w:rPr>
+              <w:t xml:space="preserve"> de continuer à vivre dans une dimension parallèle.</w:t>
+            </w:r>
+          </w:p>
+          <w:p>
+            <w:pPr>
+              <w:rPr>
+                <w:rFonts w:ascii="Baskerville Old Face" w:hAnsi="Baskerville Old Face"/>
+                <w:sz w:val="28"/>
+                <w:szCs w:val="28"/>
+              </w:rPr>
+            </w:pPr>
+            <w:r>
+              <w:rPr>
+                <w:rFonts w:ascii="Baskerville Old Face" w:hAnsi="Baskerville Old Face"/>
+                <w:sz w:val="28"/>
+                <w:szCs w:val="28"/>
+              </w:rPr>
+              <w:t>Tam est responsable du vol de la machine temporelle par Robin</w:t>
+            </w:r>
+            <w:r>
+              <w:rPr>
+                <w:rFonts w:ascii="Baskerville Old Face" w:hAnsi="Baskerville Old Face"/>
+                <w:sz w:val="28"/>
+                <w:szCs w:val="28"/>
+              </w:rPr>
+              <w:t xml:space="preserve"> (elle a pris possession de son esprit pour ça)</w:t>
+            </w:r>
+            <w:r>
+              <w:rPr>
+                <w:rFonts w:ascii="Baskerville Old Face" w:hAnsi="Baskerville Old Face"/>
+                <w:sz w:val="28"/>
+                <w:szCs w:val="28"/>
+              </w:rPr>
+              <w:t xml:space="preserve">. Elle est aussi responsable de la possession de </w:t>
+            </w:r>
+            <w:proofErr w:type="spellStart"/>
+            <w:r>
+              <w:rPr>
+                <w:rFonts w:ascii="Baskerville Old Face" w:hAnsi="Baskerville Old Face"/>
+                <w:sz w:val="28"/>
+                <w:szCs w:val="28"/>
+              </w:rPr>
+              <w:t>Morgause</w:t>
+            </w:r>
+            <w:proofErr w:type="spellEnd"/>
+            <w:r>
+              <w:rPr>
+                <w:rFonts w:ascii="Baskerville Old Face" w:hAnsi="Baskerville Old Face"/>
+                <w:sz w:val="28"/>
+                <w:szCs w:val="28"/>
+              </w:rPr>
+              <w:t xml:space="preserve"> qui lui permet d’agir à l’époque d’</w:t>
+            </w:r>
+            <w:proofErr w:type="spellStart"/>
+            <w:r>
+              <w:rPr>
+                <w:rFonts w:ascii="Baskerville Old Face" w:hAnsi="Baskerville Old Face"/>
+                <w:sz w:val="28"/>
+                <w:szCs w:val="28"/>
+              </w:rPr>
+              <w:t>Ansgarde</w:t>
+            </w:r>
+            <w:proofErr w:type="spellEnd"/>
+            <w:r>
+              <w:rPr>
+                <w:rFonts w:ascii="Baskerville Old Face" w:hAnsi="Baskerville Old Face"/>
+                <w:sz w:val="28"/>
+                <w:szCs w:val="28"/>
+              </w:rPr>
+              <w:t xml:space="preserve"> et Aldemar.</w:t>
+            </w:r>
+          </w:p>
+          <w:p>
+            <w:pPr>
+              <w:rPr>
+                <w:rFonts w:ascii="Baskerville Old Face" w:hAnsi="Baskerville Old Face"/>
+                <w:sz w:val="28"/>
+                <w:szCs w:val="28"/>
+              </w:rPr>
+            </w:pPr>
+            <w:r>
+              <w:rPr>
+                <w:rFonts w:ascii="Baskerville Old Face" w:hAnsi="Baskerville Old Face"/>
+                <w:sz w:val="28"/>
+                <w:szCs w:val="28"/>
+              </w:rPr>
+              <w:t>Son objectif est d’empêcher Simon d’acquérir les terres du royaume de LuyNhuyre sur lesquelles se trouvent la pierre sacrée de sa tribu.</w:t>
+            </w:r>
+          </w:p>
+        </w:tc>
+        <w:tc>
+          <w:tcPr>
+            <w:tcW w:w="3366" w:type="dxa"/>
+            <w:vMerge/>
+          </w:tcPr>
+          <w:p>
+            <w:pPr>
+              <w:rPr>
+                <w:rFonts w:ascii="Baskerville Old Face" w:hAnsi="Baskerville Old Face"/>
+                <w:b/>
+                <w:bCs/>
+                <w:sz w:val="28"/>
+                <w:szCs w:val="28"/>
+              </w:rPr>
+            </w:pPr>
+          </w:p>
+        </w:tc>
+      </w:tr>
+    </w:tbl>
+    <w:p>
+      <w:pPr>
+        <w:rPr>
+          <w:rFonts w:ascii="Baskerville Old Face" w:hAnsi="Baskerville Old Face"/>
+          <w:sz w:val="28"/>
+          <w:szCs w:val="28"/>
+        </w:rPr>
+      </w:pPr>
+    </w:p>
+    <w:p>
+      <w:pPr>
+        <w:rPr>
+          <w:rFonts w:ascii="Baskerville Old Face" w:hAnsi="Baskerville Old Face"/>
+          <w:sz w:val="28"/>
+          <w:szCs w:val="28"/>
+        </w:rPr>
+      </w:pPr>
+      <w:r>
+        <w:rPr>
+          <w:rFonts w:ascii="Baskerville Old Face" w:hAnsi="Baskerville Old Face"/>
+          <w:sz w:val="28"/>
+          <w:szCs w:val="28"/>
+        </w:rPr>
+        <w:br w:type="page"/>
+      </w:r>
+    </w:p>
+    <w:tbl>
+      <w:tblPr>
+        <w:tblStyle w:val="Grilledutableau"/>
+        <w:tblW w:w="0" w:type="auto"/>
+        <w:tblBorders>
+          <w:top w:val="none" w:sz="0" w:space="0" w:color="auto"/>
+          <w:left w:val="none" w:sz="0" w:space="0" w:color="auto"/>
+          <w:bottom w:val="none" w:sz="0" w:space="0" w:color="auto"/>
+          <w:right w:val="none" w:sz="0" w:space="0" w:color="auto"/>
+          <w:insideH w:val="none" w:sz="0" w:space="0" w:color="auto"/>
+          <w:insideV w:val="none" w:sz="0" w:space="0" w:color="auto"/>
+        </w:tblBorders>
+        <w:tblLook w:val="04A0" w:firstRow="1" w:lastRow="0" w:firstColumn="1" w:lastColumn="0" w:noHBand="0" w:noVBand="1"/>
+      </w:tblPr>
+      <w:tblGrid>
+        <w:gridCol w:w="1589"/>
+        <w:gridCol w:w="4118"/>
+        <w:gridCol w:w="3365"/>
+      </w:tblGrid>
+      <w:tr>
+        <w:tc>
+          <w:tcPr>
+            <w:tcW w:w="1577" w:type="dxa"/>
+          </w:tcPr>
+          <w:p>
+            <w:pPr>
+              <w:rPr>
+                <w:rFonts w:ascii="Baskerville Old Face" w:hAnsi="Baskerville Old Face"/>
+                <w:b/>
+                <w:bCs/>
+                <w:sz w:val="28"/>
+                <w:szCs w:val="28"/>
+              </w:rPr>
+            </w:pPr>
+            <w:r>
+              <w:rPr>
+                <w:rFonts w:ascii="Baskerville Old Face" w:hAnsi="Baskerville Old Face"/>
+                <w:b/>
+                <w:bCs/>
+                <w:sz w:val="28"/>
+                <w:szCs w:val="28"/>
+              </w:rPr>
+              <w:lastRenderedPageBreak/>
+              <w:t>Nom</w:t>
+            </w:r>
+          </w:p>
+        </w:tc>
+        <w:tc>
+          <w:tcPr>
+            <w:tcW w:w="4119" w:type="dxa"/>
+          </w:tcPr>
+          <w:p>
+            <w:pPr>
+              <w:rPr>
+                <w:rFonts w:ascii="Baskerville Old Face" w:hAnsi="Baskerville Old Face"/>
+                <w:b/>
+                <w:bCs/>
+                <w:sz w:val="28"/>
+                <w:szCs w:val="28"/>
+              </w:rPr>
+            </w:pPr>
+            <w:r>
+              <w:rPr>
+                <w:rFonts w:ascii="Baskerville Old Face" w:hAnsi="Baskerville Old Face"/>
+                <w:sz w:val="28"/>
+                <w:szCs w:val="28"/>
+              </w:rPr>
+              <w:t xml:space="preserve">Simon </w:t>
+            </w:r>
+            <w:proofErr w:type="spellStart"/>
+            <w:r>
+              <w:rPr>
+                <w:rFonts w:ascii="Baskerville Old Face" w:hAnsi="Baskerville Old Face"/>
+                <w:sz w:val="28"/>
+                <w:szCs w:val="28"/>
+              </w:rPr>
+              <w:t>Cussonnet</w:t>
+            </w:r>
+            <w:proofErr w:type="spellEnd"/>
+          </w:p>
+        </w:tc>
+        <w:tc>
+          <w:tcPr>
+            <w:tcW w:w="3366" w:type="dxa"/>
+            <w:vMerge w:val="restart"/>
+          </w:tcPr>
+          <w:p>
+            <w:pPr>
+              <w:rPr>
+                <w:rFonts w:ascii="Baskerville Old Face" w:hAnsi="Baskerville Old Face"/>
+                <w:b/>
+                <w:bCs/>
+                <w:sz w:val="28"/>
+                <w:szCs w:val="28"/>
+              </w:rPr>
+            </w:pPr>
+          </w:p>
+        </w:tc>
+      </w:tr>
+      <w:tr>
+        <w:tc>
+          <w:tcPr>
+            <w:tcW w:w="1577" w:type="dxa"/>
+          </w:tcPr>
+          <w:p>
+            <w:pPr>
+              <w:rPr>
+                <w:rFonts w:ascii="Baskerville Old Face" w:hAnsi="Baskerville Old Face"/>
+                <w:b/>
+                <w:bCs/>
+                <w:sz w:val="28"/>
+                <w:szCs w:val="28"/>
+              </w:rPr>
+            </w:pPr>
+            <w:r>
+              <w:rPr>
+                <w:rFonts w:ascii="Baskerville Old Face" w:hAnsi="Baskerville Old Face"/>
+                <w:b/>
+                <w:bCs/>
+                <w:sz w:val="28"/>
+                <w:szCs w:val="28"/>
+              </w:rPr>
+              <w:t>Origine</w:t>
+            </w:r>
+            <w:r>
+              <w:rPr>
+                <w:rFonts w:ascii="Baskerville Old Face" w:hAnsi="Baskerville Old Face"/>
+                <w:sz w:val="28"/>
+                <w:szCs w:val="28"/>
+              </w:rPr>
+              <w:t> </w:t>
+            </w:r>
+          </w:p>
+        </w:tc>
+        <w:tc>
+          <w:tcPr>
+            <w:tcW w:w="4119" w:type="dxa"/>
+          </w:tcPr>
+          <w:p>
+            <w:pPr>
+              <w:rPr>
+                <w:rFonts w:ascii="Baskerville Old Face" w:hAnsi="Baskerville Old Face"/>
+                <w:b/>
+                <w:bCs/>
+                <w:sz w:val="28"/>
+                <w:szCs w:val="28"/>
+              </w:rPr>
+            </w:pPr>
+            <w:r>
+              <w:rPr>
+                <w:rFonts w:ascii="Baskerville Old Face" w:hAnsi="Baskerville Old Face"/>
+                <w:sz w:val="28"/>
+                <w:szCs w:val="28"/>
+              </w:rPr>
+              <w:t xml:space="preserve">Ville de </w:t>
+            </w:r>
+            <w:proofErr w:type="spellStart"/>
+            <w:r>
+              <w:rPr>
+                <w:rFonts w:ascii="Baskerville Old Face" w:hAnsi="Baskerville Old Face"/>
+                <w:sz w:val="28"/>
+                <w:szCs w:val="28"/>
+              </w:rPr>
+              <w:t>Taure-et-L’Eure</w:t>
+            </w:r>
+            <w:proofErr w:type="spellEnd"/>
+          </w:p>
+        </w:tc>
+        <w:tc>
+          <w:tcPr>
+            <w:tcW w:w="3366" w:type="dxa"/>
+            <w:vMerge/>
+          </w:tcPr>
+          <w:p>
+            <w:pPr>
+              <w:rPr>
+                <w:rFonts w:ascii="Baskerville Old Face" w:hAnsi="Baskerville Old Face"/>
+                <w:b/>
+                <w:bCs/>
+                <w:sz w:val="28"/>
+                <w:szCs w:val="28"/>
+              </w:rPr>
+            </w:pPr>
+          </w:p>
+        </w:tc>
+      </w:tr>
+      <w:tr>
+        <w:tc>
+          <w:tcPr>
+            <w:tcW w:w="1577" w:type="dxa"/>
+          </w:tcPr>
+          <w:p>
+            <w:pPr>
+              <w:rPr>
+                <w:rFonts w:ascii="Baskerville Old Face" w:hAnsi="Baskerville Old Face"/>
+                <w:b/>
+                <w:bCs/>
+                <w:sz w:val="28"/>
+                <w:szCs w:val="28"/>
+              </w:rPr>
+            </w:pPr>
+            <w:r>
+              <w:rPr>
+                <w:rFonts w:ascii="Baskerville Old Face" w:hAnsi="Baskerville Old Face"/>
+                <w:b/>
+                <w:bCs/>
+                <w:sz w:val="28"/>
+                <w:szCs w:val="28"/>
+              </w:rPr>
+              <w:t>Vocation</w:t>
+            </w:r>
+            <w:r>
+              <w:rPr>
+                <w:rFonts w:ascii="Baskerville Old Face" w:hAnsi="Baskerville Old Face"/>
+                <w:sz w:val="28"/>
+                <w:szCs w:val="28"/>
+              </w:rPr>
+              <w:t> </w:t>
+            </w:r>
+          </w:p>
+        </w:tc>
+        <w:tc>
+          <w:tcPr>
+            <w:tcW w:w="4119" w:type="dxa"/>
+          </w:tcPr>
+          <w:p>
+            <w:pPr>
+              <w:rPr>
+                <w:rFonts w:ascii="Baskerville Old Face" w:hAnsi="Baskerville Old Face"/>
+                <w:b/>
+                <w:bCs/>
+                <w:sz w:val="28"/>
+                <w:szCs w:val="28"/>
+              </w:rPr>
+            </w:pPr>
+            <w:r>
+              <w:rPr>
+                <w:rFonts w:ascii="Baskerville Old Face" w:hAnsi="Baskerville Old Face"/>
+                <w:sz w:val="28"/>
+                <w:szCs w:val="28"/>
+              </w:rPr>
+              <w:t>Savant fou</w:t>
+            </w:r>
+          </w:p>
+        </w:tc>
+        <w:tc>
+          <w:tcPr>
+            <w:tcW w:w="3366" w:type="dxa"/>
+            <w:vMerge/>
+          </w:tcPr>
+          <w:p>
+            <w:pPr>
+              <w:rPr>
+                <w:rFonts w:ascii="Baskerville Old Face" w:hAnsi="Baskerville Old Face"/>
+                <w:b/>
+                <w:bCs/>
+                <w:sz w:val="28"/>
+                <w:szCs w:val="28"/>
+              </w:rPr>
+            </w:pPr>
+          </w:p>
+        </w:tc>
+      </w:tr>
+      <w:tr>
+        <w:tc>
+          <w:tcPr>
+            <w:tcW w:w="1577" w:type="dxa"/>
+          </w:tcPr>
+          <w:p>
+            <w:pPr>
+              <w:rPr>
+                <w:rFonts w:ascii="Baskerville Old Face" w:hAnsi="Baskerville Old Face"/>
+                <w:b/>
+                <w:bCs/>
+                <w:sz w:val="28"/>
+                <w:szCs w:val="28"/>
+              </w:rPr>
+            </w:pPr>
+            <w:r>
+              <w:rPr>
+                <w:rFonts w:ascii="Baskerville Old Face" w:hAnsi="Baskerville Old Face"/>
+                <w:b/>
+                <w:bCs/>
+                <w:sz w:val="28"/>
+                <w:szCs w:val="28"/>
+              </w:rPr>
+              <w:t>PNJ</w:t>
+            </w:r>
+            <w:r>
+              <w:rPr>
+                <w:rFonts w:ascii="Baskerville Old Face" w:hAnsi="Baskerville Old Face"/>
+                <w:sz w:val="28"/>
+                <w:szCs w:val="28"/>
+              </w:rPr>
+              <w:t> </w:t>
+            </w:r>
+          </w:p>
+        </w:tc>
+        <w:tc>
+          <w:tcPr>
+            <w:tcW w:w="4119" w:type="dxa"/>
+          </w:tcPr>
+          <w:p>
+            <w:pPr>
+              <w:rPr>
+                <w:rFonts w:ascii="Baskerville Old Face" w:hAnsi="Baskerville Old Face"/>
+                <w:b/>
+                <w:bCs/>
+                <w:sz w:val="28"/>
+                <w:szCs w:val="28"/>
+              </w:rPr>
+            </w:pPr>
+            <w:r>
+              <w:rPr>
+                <w:rFonts w:ascii="Baskerville Old Face" w:hAnsi="Baskerville Old Face"/>
+                <w:sz w:val="28"/>
+                <w:szCs w:val="28"/>
+              </w:rPr>
+              <w:t>Oui</w:t>
+            </w:r>
+          </w:p>
+        </w:tc>
+        <w:tc>
+          <w:tcPr>
+            <w:tcW w:w="3366" w:type="dxa"/>
+            <w:vMerge/>
+          </w:tcPr>
+          <w:p>
+            <w:pPr>
+              <w:rPr>
+                <w:rFonts w:ascii="Baskerville Old Face" w:hAnsi="Baskerville Old Face"/>
+                <w:b/>
+                <w:bCs/>
+                <w:sz w:val="28"/>
+                <w:szCs w:val="28"/>
+              </w:rPr>
+            </w:pPr>
+          </w:p>
+        </w:tc>
+      </w:tr>
+      <w:tr>
+        <w:tc>
+          <w:tcPr>
+            <w:tcW w:w="1577" w:type="dxa"/>
+          </w:tcPr>
+          <w:p>
+            <w:pPr>
+              <w:rPr>
+                <w:rFonts w:ascii="Baskerville Old Face" w:hAnsi="Baskerville Old Face"/>
+                <w:b/>
+                <w:bCs/>
+                <w:sz w:val="28"/>
+                <w:szCs w:val="28"/>
+              </w:rPr>
+            </w:pPr>
+            <w:r>
+              <w:rPr>
+                <w:rFonts w:ascii="Baskerville Old Face" w:hAnsi="Baskerville Old Face"/>
+                <w:b/>
+                <w:bCs/>
+                <w:sz w:val="28"/>
+                <w:szCs w:val="28"/>
+              </w:rPr>
+              <w:t>Description</w:t>
+            </w:r>
+            <w:r>
+              <w:rPr>
+                <w:rFonts w:ascii="Baskerville Old Face" w:hAnsi="Baskerville Old Face"/>
+                <w:sz w:val="28"/>
+                <w:szCs w:val="28"/>
+              </w:rPr>
+              <w:t> </w:t>
+            </w:r>
+          </w:p>
+        </w:tc>
+        <w:tc>
+          <w:tcPr>
+            <w:tcW w:w="4119" w:type="dxa"/>
+          </w:tcPr>
+          <w:p>
+            <w:pPr>
+              <w:rPr>
+                <w:rFonts w:ascii="Baskerville Old Face" w:hAnsi="Baskerville Old Face"/>
+                <w:sz w:val="28"/>
+                <w:szCs w:val="28"/>
+              </w:rPr>
+            </w:pPr>
+            <w:r>
+              <w:rPr>
+                <w:rFonts w:ascii="Baskerville Old Face" w:hAnsi="Baskerville Old Face"/>
+                <w:sz w:val="28"/>
+                <w:szCs w:val="28"/>
+              </w:rPr>
+              <w:t>Simon est le créateur de la machine à voyager dans le temps.</w:t>
+            </w:r>
+            <w:r>
+              <w:rPr>
+                <w:rFonts w:ascii="Baskerville Old Face" w:hAnsi="Baskerville Old Face"/>
+                <w:sz w:val="28"/>
+                <w:szCs w:val="28"/>
+              </w:rPr>
+              <w:t xml:space="preserve"> Il vit en 2597 dans la ville de </w:t>
+            </w:r>
+            <w:proofErr w:type="spellStart"/>
+            <w:r>
+              <w:rPr>
+                <w:rFonts w:ascii="Baskerville Old Face" w:hAnsi="Baskerville Old Face"/>
+                <w:sz w:val="28"/>
+                <w:szCs w:val="28"/>
+              </w:rPr>
+              <w:t>Taure-et-L’Eure</w:t>
+            </w:r>
+            <w:proofErr w:type="spellEnd"/>
+            <w:r>
+              <w:rPr>
+                <w:rFonts w:ascii="Baskerville Old Face" w:hAnsi="Baskerville Old Face"/>
+                <w:sz w:val="28"/>
+                <w:szCs w:val="28"/>
+              </w:rPr>
+              <w:t xml:space="preserve"> qui se trouve géographiquement au même endroit que le royaume de </w:t>
+            </w:r>
+            <w:proofErr w:type="spellStart"/>
+            <w:r>
+              <w:rPr>
+                <w:rFonts w:ascii="Baskerville Old Face" w:hAnsi="Baskerville Old Face"/>
+                <w:sz w:val="28"/>
+                <w:szCs w:val="28"/>
+              </w:rPr>
+              <w:t>LuyNhuire</w:t>
+            </w:r>
+            <w:proofErr w:type="spellEnd"/>
+            <w:r>
+              <w:rPr>
+                <w:rFonts w:ascii="Baskerville Old Face" w:hAnsi="Baskerville Old Face"/>
+                <w:sz w:val="28"/>
+                <w:szCs w:val="28"/>
+              </w:rPr>
+              <w:t>.</w:t>
+            </w:r>
+          </w:p>
+          <w:p>
+            <w:pPr>
+              <w:rPr>
+                <w:rFonts w:ascii="Baskerville Old Face" w:hAnsi="Baskerville Old Face"/>
+                <w:sz w:val="28"/>
+                <w:szCs w:val="28"/>
+              </w:rPr>
+            </w:pPr>
+            <w:r>
+              <w:rPr>
+                <w:rFonts w:ascii="Baskerville Old Face" w:hAnsi="Baskerville Old Face"/>
+                <w:sz w:val="28"/>
+                <w:szCs w:val="28"/>
+              </w:rPr>
+              <w:t xml:space="preserve">Sa machine est ainsi </w:t>
+            </w:r>
+            <w:proofErr w:type="spellStart"/>
+            <w:r>
+              <w:rPr>
+                <w:rFonts w:ascii="Baskerville Old Face" w:hAnsi="Baskerville Old Face"/>
+                <w:sz w:val="28"/>
+                <w:szCs w:val="28"/>
+              </w:rPr>
+              <w:t>conçuequ’elle</w:t>
+            </w:r>
+            <w:proofErr w:type="spellEnd"/>
+            <w:r>
+              <w:rPr>
+                <w:rFonts w:ascii="Baskerville Old Face" w:hAnsi="Baskerville Old Face"/>
+                <w:sz w:val="28"/>
+                <w:szCs w:val="28"/>
+              </w:rPr>
+              <w:t xml:space="preserve"> ne lui permet d’atteindre que 3 époques :</w:t>
+            </w:r>
+          </w:p>
+          <w:p>
+            <w:pPr>
+              <w:pStyle w:val="Paragraphedeliste"/>
+              <w:numPr>
+                <w:ilvl w:val="0"/>
+                <w:numId w:val="1"/>
+              </w:numPr>
+              <w:rPr>
+                <w:rFonts w:ascii="Baskerville Old Face" w:hAnsi="Baskerville Old Face"/>
+                <w:sz w:val="28"/>
+                <w:szCs w:val="28"/>
+              </w:rPr>
+            </w:pPr>
+            <w:r>
+              <w:rPr>
+                <w:rFonts w:ascii="Baskerville Old Face" w:hAnsi="Baskerville Old Face"/>
+                <w:sz w:val="28"/>
+                <w:szCs w:val="28"/>
+              </w:rPr>
+              <w:t>Son époque en 2597</w:t>
+            </w:r>
+          </w:p>
+          <w:p>
+            <w:pPr>
+              <w:pStyle w:val="Paragraphedeliste"/>
+              <w:numPr>
+                <w:ilvl w:val="0"/>
+                <w:numId w:val="1"/>
+              </w:numPr>
+              <w:rPr>
+                <w:rFonts w:ascii="Baskerville Old Face" w:hAnsi="Baskerville Old Face"/>
+                <w:sz w:val="28"/>
+                <w:szCs w:val="28"/>
+              </w:rPr>
+            </w:pPr>
+            <w:r>
+              <w:rPr>
+                <w:rFonts w:ascii="Baskerville Old Face" w:hAnsi="Baskerville Old Face"/>
+                <w:sz w:val="28"/>
+                <w:szCs w:val="28"/>
+              </w:rPr>
+              <w:t>L’époque médiévale</w:t>
+            </w:r>
+          </w:p>
+          <w:p>
+            <w:pPr>
+              <w:pStyle w:val="Paragraphedeliste"/>
+              <w:numPr>
+                <w:ilvl w:val="0"/>
+                <w:numId w:val="1"/>
+              </w:numPr>
+              <w:rPr>
+                <w:rFonts w:ascii="Baskerville Old Face" w:hAnsi="Baskerville Old Face"/>
+                <w:sz w:val="28"/>
+                <w:szCs w:val="28"/>
+              </w:rPr>
+            </w:pPr>
+            <w:r>
+              <w:rPr>
+                <w:rFonts w:ascii="Baskerville Old Face" w:hAnsi="Baskerville Old Face"/>
+                <w:sz w:val="28"/>
+                <w:szCs w:val="28"/>
+              </w:rPr>
+              <w:t>L’époque Néolithique.</w:t>
+            </w:r>
+          </w:p>
+          <w:p>
+            <w:pPr>
+              <w:rPr>
+                <w:rFonts w:ascii="Baskerville Old Face" w:hAnsi="Baskerville Old Face"/>
+                <w:sz w:val="28"/>
+                <w:szCs w:val="28"/>
+              </w:rPr>
+            </w:pPr>
+            <w:r>
+              <w:rPr>
+                <w:rFonts w:ascii="Baskerville Old Face" w:hAnsi="Baskerville Old Face"/>
+                <w:sz w:val="28"/>
+                <w:szCs w:val="28"/>
+              </w:rPr>
+              <w:t>En se rendant à l’époque Néolithique, il a pu assister à l’utilisation de la pierre sacrée par la tribu de Tam. Il a alors décid</w:t>
+            </w:r>
+            <w:r>
+              <w:rPr>
+                <w:rFonts w:ascii="Baskerville Old Face" w:hAnsi="Baskerville Old Face"/>
+                <w:sz w:val="28"/>
+                <w:szCs w:val="28"/>
+              </w:rPr>
+              <w:t>é</w:t>
+            </w:r>
+            <w:r>
+              <w:rPr>
+                <w:rFonts w:ascii="Baskerville Old Face" w:hAnsi="Baskerville Old Face"/>
+                <w:sz w:val="28"/>
+                <w:szCs w:val="28"/>
+              </w:rPr>
+              <w:t xml:space="preserve"> de récupérer cette roche pour améliorer sa machine et avoir un contrôle absolu sur le temps (et devenir l’équivalent d’un dieu).</w:t>
+            </w:r>
+          </w:p>
+          <w:p>
+            <w:pPr>
+              <w:rPr>
+                <w:rFonts w:ascii="Baskerville Old Face" w:hAnsi="Baskerville Old Face"/>
+                <w:sz w:val="28"/>
+                <w:szCs w:val="28"/>
+              </w:rPr>
+            </w:pPr>
+            <w:r>
+              <w:rPr>
+                <w:rFonts w:ascii="Baskerville Old Face" w:hAnsi="Baskerville Old Face"/>
+                <w:sz w:val="28"/>
+                <w:szCs w:val="28"/>
+              </w:rPr>
+              <w:t>Mais la puissante</w:t>
+            </w:r>
+            <w:r>
+              <w:rPr>
+                <w:rFonts w:ascii="Baskerville Old Face" w:hAnsi="Baskerville Old Face"/>
+                <w:sz w:val="28"/>
+                <w:szCs w:val="28"/>
+              </w:rPr>
+              <w:t xml:space="preserve"> tribu de Tam ne le laisse pas s’approcher de la roche</w:t>
+            </w:r>
+            <w:r>
+              <w:rPr>
+                <w:rFonts w:ascii="Baskerville Old Face" w:hAnsi="Baskerville Old Face"/>
+                <w:sz w:val="28"/>
+                <w:szCs w:val="28"/>
+              </w:rPr>
+              <w:t xml:space="preserve"> à l’époque néolithique.</w:t>
+            </w:r>
+          </w:p>
+          <w:p>
+            <w:pPr>
+              <w:rPr>
+                <w:rFonts w:ascii="Baskerville Old Face" w:hAnsi="Baskerville Old Face"/>
+                <w:sz w:val="28"/>
+                <w:szCs w:val="28"/>
+              </w:rPr>
+            </w:pPr>
+            <w:r>
+              <w:rPr>
+                <w:rFonts w:ascii="Baskerville Old Face" w:hAnsi="Baskerville Old Face"/>
+                <w:sz w:val="28"/>
+                <w:szCs w:val="28"/>
+              </w:rPr>
+              <w:t xml:space="preserve">A son époque, un château </w:t>
+            </w:r>
+            <w:r>
+              <w:rPr>
+                <w:rFonts w:ascii="Baskerville Old Face" w:hAnsi="Baskerville Old Face"/>
+                <w:sz w:val="28"/>
+                <w:szCs w:val="28"/>
+              </w:rPr>
+              <w:t>(celui d’</w:t>
+            </w:r>
+            <w:proofErr w:type="spellStart"/>
+            <w:r>
+              <w:rPr>
+                <w:rFonts w:ascii="Baskerville Old Face" w:hAnsi="Baskerville Old Face"/>
+                <w:sz w:val="28"/>
+                <w:szCs w:val="28"/>
+              </w:rPr>
+              <w:t>A</w:t>
+            </w:r>
+            <w:r>
+              <w:rPr>
+                <w:rFonts w:ascii="Baskerville Old Face" w:hAnsi="Baskerville Old Face"/>
+                <w:sz w:val="28"/>
+                <w:szCs w:val="28"/>
+              </w:rPr>
+              <w:t>nsgarde</w:t>
+            </w:r>
+            <w:proofErr w:type="spellEnd"/>
+            <w:r>
+              <w:rPr>
+                <w:rFonts w:ascii="Baskerville Old Face" w:hAnsi="Baskerville Old Face"/>
+                <w:sz w:val="28"/>
+                <w:szCs w:val="28"/>
+              </w:rPr>
+              <w:t xml:space="preserve">) </w:t>
+            </w:r>
+            <w:r>
+              <w:rPr>
+                <w:rFonts w:ascii="Baskerville Old Face" w:hAnsi="Baskerville Old Face"/>
+                <w:sz w:val="28"/>
+                <w:szCs w:val="28"/>
+              </w:rPr>
+              <w:t xml:space="preserve">est construit sur le site </w:t>
+            </w:r>
+            <w:r>
+              <w:rPr>
+                <w:rFonts w:ascii="Baskerville Old Face" w:hAnsi="Baskerville Old Face"/>
+                <w:sz w:val="28"/>
+                <w:szCs w:val="28"/>
+              </w:rPr>
+              <w:t>de la pierre sacrée, et il est protégé car c’est un monument historique. Impossible donc d’accéder à la pierre à cette époque.</w:t>
+            </w:r>
+          </w:p>
+          <w:p>
+            <w:pPr>
+              <w:rPr>
+                <w:rFonts w:ascii="Baskerville Old Face" w:hAnsi="Baskerville Old Face"/>
+                <w:sz w:val="28"/>
+                <w:szCs w:val="28"/>
+              </w:rPr>
+            </w:pPr>
+            <w:r>
+              <w:rPr>
+                <w:rFonts w:ascii="Baskerville Old Face" w:hAnsi="Baskerville Old Face"/>
+                <w:sz w:val="28"/>
+                <w:szCs w:val="28"/>
+              </w:rPr>
+              <w:t>La seule solution pour Simon est de s’approprier les terres d’</w:t>
+            </w:r>
+            <w:proofErr w:type="spellStart"/>
+            <w:r>
+              <w:rPr>
+                <w:rFonts w:ascii="Baskerville Old Face" w:hAnsi="Baskerville Old Face"/>
+                <w:sz w:val="28"/>
+                <w:szCs w:val="28"/>
+              </w:rPr>
+              <w:t>Ansgarde</w:t>
+            </w:r>
+            <w:proofErr w:type="spellEnd"/>
+            <w:r>
+              <w:rPr>
+                <w:rFonts w:ascii="Baskerville Old Face" w:hAnsi="Baskerville Old Face"/>
+                <w:sz w:val="28"/>
+                <w:szCs w:val="28"/>
+              </w:rPr>
+              <w:t xml:space="preserve"> </w:t>
+            </w:r>
+            <w:r>
+              <w:rPr>
+                <w:rFonts w:ascii="Baskerville Old Face" w:hAnsi="Baskerville Old Face"/>
+                <w:sz w:val="28"/>
+                <w:szCs w:val="28"/>
+              </w:rPr>
+              <w:t xml:space="preserve">à l’époque médiévale </w:t>
+            </w:r>
+            <w:r>
+              <w:rPr>
+                <w:rFonts w:ascii="Baskerville Old Face" w:hAnsi="Baskerville Old Face"/>
+                <w:sz w:val="28"/>
+                <w:szCs w:val="28"/>
+              </w:rPr>
+              <w:t>à travers un chantage (Son royaume contre la vie d’Aldemar).</w:t>
+            </w:r>
+          </w:p>
+        </w:tc>
+        <w:tc>
+          <w:tcPr>
+            <w:tcW w:w="3366" w:type="dxa"/>
+            <w:vMerge/>
+          </w:tcPr>
+          <w:p>
+            <w:pPr>
+              <w:rPr>
+                <w:rFonts w:ascii="Baskerville Old Face" w:hAnsi="Baskerville Old Face"/>
+                <w:b/>
+                <w:bCs/>
+                <w:sz w:val="28"/>
+                <w:szCs w:val="28"/>
+              </w:rPr>
+            </w:pPr>
+          </w:p>
+        </w:tc>
+      </w:tr>
+    </w:tbl>
+    <w:p>
+      <w:pPr>
+        <w:rPr>
+          <w:rFonts w:ascii="Baskerville Old Face" w:hAnsi="Baskerville Old Face"/>
+          <w:sz w:val="28"/>
+          <w:szCs w:val="28"/>
+        </w:rPr>
+      </w:pPr>
     </w:p>
     <w:sectPr>
       <w:pgSz w:w="11906" w:h="16838"/>
@@ -537,8 +1957,128 @@
 </w:document>
 </file>
 
+<file path=word/numbering.xml><?xml version="1.0" encoding="utf-8"?>
+<w:numbering xmlns:wpc="http://schemas.microsoft.com/office/word/2010/wordprocessingCanvas" xmlns:cx="http://schemas.microsoft.com/office/drawing/2014/chartex" xmlns:cx1="http://schemas.microsoft.com/office/drawing/2015/9/8/chartex" xmlns:cx2="http://schemas.microsoft.com/office/drawing/2015/10/21/chartex" xmlns:cx3="http://schemas.microsoft.com/office/drawing/2016/5/9/chartex" xmlns:cx4="http://schemas.microsoft.com/office/drawing/2016/5/10/chartex" xmlns:cx5="http://schemas.microsoft.com/office/drawing/2016/5/11/chartex" xmlns:cx6="http://schemas.microsoft.com/office/drawing/2016/5/12/chartex" xmlns:cx7="http://schemas.microsoft.com/office/drawing/2016/5/13/chartex" xmlns:cx8="http://schemas.microsoft.com/office/drawing/2016/5/14/chartex" xmlns:mc="http://schemas.openxmlformats.org/markup-compatibility/2006" xmlns:aink="http://schemas.microsoft.com/office/drawing/2016/ink" xmlns:am3d="http://schemas.microsoft.com/office/drawing/2017/model3d" xmlns:o="urn:schemas-microsoft-com:office:office" xmlns:oel="http://schemas.microsoft.com/office/2019/extlst" xmlns:r="http://schemas.openxmlformats.org/officeDocument/2006/relationships" xmlns:m="http://schemas.openxmlformats.org/officeDocument/2006/math" xmlns:v="urn:schemas-microsoft-com:vml" xmlns:wp14="http://schemas.microsoft.com/office/word/2010/wordprocessingDrawing" xmlns:wp="http://schemas.openxmlformats.org/drawingml/2006/wordprocessingDrawing" xmlns:w10="urn:schemas-microsoft-com:office:word" xmlns:w="http://schemas.openxmlformats.org/wordprocessingml/2006/main" xmlns:w14="http://schemas.microsoft.com/office/word/2010/wordml" xmlns:w15="http://schemas.microsoft.com/office/word/2012/wordml" xmlns:w16cex="http://schemas.microsoft.com/office/word/2018/wordml/cex" xmlns:w16cid="http://schemas.microsoft.com/office/word/2016/wordml/cid" xmlns:w16="http://schemas.microsoft.com/office/word/2018/wordml" xmlns:w16du="http://schemas.microsoft.com/office/word/2023/wordml/word16du" xmlns:w16sdtdh="http://schemas.microsoft.com/office/word/2020/wordml/sdtdatahash" xmlns:w16sdtfl="http://schemas.microsoft.com/office/word/2024/wordml/sdtformatlock" xmlns:w16se="http://schemas.microsoft.com/office/word/2015/wordml/symex" xmlns:wpg="http://schemas.microsoft.com/office/word/2010/wordprocessingGroup" xmlns:wpi="http://schemas.microsoft.com/office/word/2010/wordprocessingInk" xmlns:wne="http://schemas.microsoft.com/office/word/2006/wordml" xmlns:wps="http://schemas.microsoft.com/office/word/2010/wordprocessingShape" mc:Ignorable="w14 w15 w16se w16cid w16 w16cex w16sdtdh w16sdtfl w16du wp14">
+  <w:abstractNum w:abstractNumId="0" w15:restartNumberingAfterBreak="0">
+    <w:nsid w:val="7BAE1E92"/>
+    <w:multiLevelType w:val="hybridMultilevel"/>
+    <w:tmpl w:val="A17EE460"/>
+    <w:lvl w:ilvl="0" w:tplc="324E371C">
+      <w:numFmt w:val="bullet"/>
+      <w:lvlText w:val="-"/>
+      <w:lvlJc w:val="left"/>
+      <w:pPr>
+        <w:ind w:left="720" w:hanging="360"/>
+      </w:pPr>
+      <w:rPr>
+        <w:rFonts w:ascii="Baskerville Old Face" w:eastAsiaTheme="minorHAnsi" w:hAnsi="Baskerville Old Face" w:cstheme="minorBidi" w:hint="default"/>
+      </w:rPr>
+    </w:lvl>
+    <w:lvl w:ilvl="1" w:tplc="040C0003" w:tentative="1">
+      <w:start w:val="1"/>
+      <w:numFmt w:val="bullet"/>
+      <w:lvlText w:val="o"/>
+      <w:lvlJc w:val="left"/>
+      <w:pPr>
+        <w:ind w:left="1440" w:hanging="360"/>
+      </w:pPr>
+      <w:rPr>
+        <w:rFonts w:ascii="Courier New" w:hAnsi="Courier New" w:cs="Courier New" w:hint="default"/>
+      </w:rPr>
+    </w:lvl>
+    <w:lvl w:ilvl="2" w:tplc="040C0005" w:tentative="1">
+      <w:start w:val="1"/>
+      <w:numFmt w:val="bullet"/>
+      <w:lvlText w:val=""/>
+      <w:lvlJc w:val="left"/>
+      <w:pPr>
+        <w:ind w:left="2160" w:hanging="360"/>
+      </w:pPr>
+      <w:rPr>
+        <w:rFonts w:ascii="Wingdings" w:hAnsi="Wingdings" w:hint="default"/>
+      </w:rPr>
+    </w:lvl>
+    <w:lvl w:ilvl="3" w:tplc="040C0001" w:tentative="1">
+      <w:start w:val="1"/>
+      <w:numFmt w:val="bullet"/>
+      <w:lvlText w:val=""/>
+      <w:lvlJc w:val="left"/>
+      <w:pPr>
+        <w:ind w:left="2880" w:hanging="360"/>
+      </w:pPr>
+      <w:rPr>
+        <w:rFonts w:ascii="Symbol" w:hAnsi="Symbol" w:hint="default"/>
+      </w:rPr>
+    </w:lvl>
+    <w:lvl w:ilvl="4" w:tplc="040C0003" w:tentative="1">
+      <w:start w:val="1"/>
+      <w:numFmt w:val="bullet"/>
+      <w:lvlText w:val="o"/>
+      <w:lvlJc w:val="left"/>
+      <w:pPr>
+        <w:ind w:left="3600" w:hanging="360"/>
+      </w:pPr>
+      <w:rPr>
+        <w:rFonts w:ascii="Courier New" w:hAnsi="Courier New" w:cs="Courier New" w:hint="default"/>
+      </w:rPr>
+    </w:lvl>
+    <w:lvl w:ilvl="5" w:tplc="040C0005" w:tentative="1">
+      <w:start w:val="1"/>
+      <w:numFmt w:val="bullet"/>
+      <w:lvlText w:val=""/>
+      <w:lvlJc w:val="left"/>
+      <w:pPr>
+        <w:ind w:left="4320" w:hanging="360"/>
+      </w:pPr>
+      <w:rPr>
+        <w:rFonts w:ascii="Wingdings" w:hAnsi="Wingdings" w:hint="default"/>
+      </w:rPr>
+    </w:lvl>
+    <w:lvl w:ilvl="6" w:tplc="040C0001" w:tentative="1">
+      <w:start w:val="1"/>
+      <w:numFmt w:val="bullet"/>
+      <w:lvlText w:val=""/>
+      <w:lvlJc w:val="left"/>
+      <w:pPr>
+        <w:ind w:left="5040" w:hanging="360"/>
+      </w:pPr>
+      <w:rPr>
+        <w:rFonts w:ascii="Symbol" w:hAnsi="Symbol" w:hint="default"/>
+      </w:rPr>
+    </w:lvl>
+    <w:lvl w:ilvl="7" w:tplc="040C0003" w:tentative="1">
+      <w:start w:val="1"/>
+      <w:numFmt w:val="bullet"/>
+      <w:lvlText w:val="o"/>
+      <w:lvlJc w:val="left"/>
+      <w:pPr>
+        <w:ind w:left="5760" w:hanging="360"/>
+      </w:pPr>
+      <w:rPr>
+        <w:rFonts w:ascii="Courier New" w:hAnsi="Courier New" w:cs="Courier New" w:hint="default"/>
+      </w:rPr>
+    </w:lvl>
+    <w:lvl w:ilvl="8" w:tplc="040C0005" w:tentative="1">
+      <w:start w:val="1"/>
+      <w:numFmt w:val="bullet"/>
+      <w:lvlText w:val=""/>
+      <w:lvlJc w:val="left"/>
+      <w:pPr>
+        <w:ind w:left="6480" w:hanging="360"/>
+      </w:pPr>
+      <w:rPr>
+        <w:rFonts w:ascii="Wingdings" w:hAnsi="Wingdings" w:hint="default"/>
+      </w:rPr>
+    </w:lvl>
+  </w:abstractNum>
+  <w:num w:numId="1" w16cid:durableId="1018391142">
+    <w:abstractNumId w:val="0"/>
+  </w:num>
+</w:numbering>
+</file>
+
 <file path=word/styles.xml><?xml version="1.0" encoding="utf-8"?>
-<w:styles xmlns:mc="http://schemas.openxmlformats.org/markup-compatibility/2006" xmlns:r="http://schemas.openxmlformats.org/officeDocument/2006/relationships" xmlns:w="http://schemas.openxmlformats.org/wordprocessingml/2006/main" xmlns:w14="http://schemas.microsoft.com/office/word/2010/wordml" xmlns:w15="http://schemas.microsoft.com/office/word/2012/wordml" xmlns:w16cex="http://schemas.microsoft.com/office/word/2018/wordml/cex" xmlns:w16cid="http://schemas.microsoft.com/office/word/2016/wordml/cid" xmlns:w16="http://schemas.microsoft.com/office/word/2018/wordml" xmlns:w16sdtdh="http://schemas.microsoft.com/office/word/2020/wordml/sdtdatahash" xmlns:w16se="http://schemas.microsoft.com/office/word/2015/wordml/symex" mc:Ignorable="w14 w15 w16se w16cid w16 w16cex w16sdtdh">
+<w:styles xmlns:mc="http://schemas.openxmlformats.org/markup-compatibility/2006" xmlns:r="http://schemas.openxmlformats.org/officeDocument/2006/relationships" xmlns:w="http://schemas.openxmlformats.org/wordprocessingml/2006/main" xmlns:w14="http://schemas.microsoft.com/office/word/2010/wordml" xmlns:w15="http://schemas.microsoft.com/office/word/2012/wordml" xmlns:w16cex="http://schemas.microsoft.com/office/word/2018/wordml/cex" xmlns:w16cid="http://schemas.microsoft.com/office/word/2016/wordml/cid" xmlns:w16="http://schemas.microsoft.com/office/word/2018/wordml" xmlns:w16du="http://schemas.microsoft.com/office/word/2023/wordml/word16du" xmlns:w16sdtdh="http://schemas.microsoft.com/office/word/2020/wordml/sdtdatahash" xmlns:w16sdtfl="http://schemas.microsoft.com/office/word/2024/wordml/sdtformatlock" xmlns:w16se="http://schemas.microsoft.com/office/word/2015/wordml/symex" mc:Ignorable="w14 w15 w16se w16cid w16 w16cex w16sdtdh w16sdtfl w16du">
   <w:docDefaults>
     <w:rPrDefault>
       <w:rPr>

</xml_diff>